<commit_message>
Update Group 11 course materials and launch guidance
</commit_message>
<xml_diff>
--- a/Group11_Project_Proposal.docx
+++ b/Group11_Project_Proposal.docx
@@ -12,54 +12,34 @@
     </w:p>
     <w:p>
       <w:pPr>
-        <w:pStyle w:val="Subtitle"/>
+        <w:keepLines/>
       </w:pPr>
-      <w:r>
-        <w:t>An AI Assisted Job Search and Resume Matching Platform</w:t>
-      </w:r>
-    </w:p>
-    <w:p>
-      <w:pPr>
-        <w:spacing w:after="80"/>
-      </w:pPr>
-      <w:r>
-        <w:rPr>
-          <w:b/>
-        </w:rPr>
-        <w:t xml:space="preserve">Course: </w:t>
-      </w:r>
       <w:r>
         <w:t>INT6181 Applied Programming with Python</w:t>
       </w:r>
     </w:p>
     <w:p>
       <w:pPr>
-        <w:spacing w:after="80"/>
+        <w:keepLines/>
       </w:pPr>
       <w:r>
-        <w:rPr>
-          <w:b/>
-        </w:rPr>
-        <w:t xml:space="preserve">Group: </w:t>
-      </w:r>
-      <w:r>
-        <w:t>11</w:t>
+        <w:t>Group 11</w:t>
       </w:r>
     </w:p>
     <w:p>
       <w:pPr>
-        <w:spacing w:after="240"/>
+        <w:keepLines/>
       </w:pPr>
       <w:r>
-        <w:rPr>
-          <w:b/>
-        </w:rPr>
-        <w:t xml:space="preserve">Members: </w:t>
+        <w:t>Members: OU JUNHANG, ZHANG XIQIAN, JIANG YIFAN, CAI SHANGHENG, GUO ZHENGKUN</w:t>
       </w:r>
+    </w:p>
+    <w:p>
+      <w:pPr>
+        <w:keepLines/>
+      </w:pPr>
       <w:r>
-        <w:t>OU JUNHANG, ZHANG XIQIAN, JIANG YIFAN,</w:t>
-        <w:br/>
-        <w:t>CAI SHANGHENG, GUO ZHENGKUN</w:t>
+        <w:t>Revised scope dated 30 September 2026</w:t>
       </w:r>
     </w:p>
     <w:p>
@@ -67,17 +47,15 @@
         <w:pStyle w:val="Heading1"/>
       </w:pPr>
       <w:r>
-        <w:t>Background and Objectives</w:t>
+        <w:t>Background and objectives</w:t>
       </w:r>
     </w:p>
     <w:p>
+      <w:pPr>
+        <w:keepLines/>
+      </w:pPr>
       <w:r>
-        <w:t>Job seekers often spend considerable time searching across recruitment websites, comparing job requirements with their experience, and keeping track of applications. Job descriptions vary in format, while simple keyword searches provide limited guidance about a candidate's suitability. This project proposes JobCompass, a Python application that combines resume analysis, job collection, explainable matching, and application tracking in a local browser interface.</w:t>
-      </w:r>
-    </w:p>
-    <w:p>
-      <w:r>
-        <w:t>The project aims to help users identify relevant opportunities and understand the strengths and gaps in their applications. Users will be able to upload a resume in TXT, DOCX, or text-based PDF format, or paste its contents directly. The application will extract skills, educational background, and explicitly stated work experience. It will retain supporting text from the resume so that users can inspect the evidence behind the analysis.</w:t>
+        <w:t>Job seekers compare inconsistent descriptions across recruitment websites and often keep application records separately. JobCompass addresses this problem with a local Python application that connects resume analysis, job discovery and application tracking. The project aims to make recommendations inspectable by showing the evidence and missing requirements behind a ranking score. It supports individual job seekers and provides a substantial course project combining file processing, information retrieval, database operations and network integration.</w:t>
       </w:r>
     </w:p>
     <w:p>
@@ -85,17 +63,23 @@
         <w:pStyle w:val="Heading1"/>
       </w:pPr>
       <w:r>
-        <w:t>Job Collection and Matching</w:t>
+        <w:t>Functional scope</w:t>
       </w:r>
     </w:p>
     <w:p>
+      <w:pPr>
+        <w:keepLines/>
+      </w:pPr>
       <w:r>
-        <w:t>JobCompass will collect job listings from the public interfaces provided by Remotive and Arbeitnow. It will also support CSV and JSON imports, manual entry, and the extraction of structured job information from accessible webpages. Each listing will retain its source and original link. Collection will use caching and request limits, while webpage collection will respect access restrictions. Authenticated recruitment websites and CAPTCHA bypassing are outside the project's scope.</w:t>
+        <w:t>Users can paste a resume or import TXT, DOCX and text-based PDF files. The application extracts dictionary skills, education and explicitly stated experience, then keeps supporting resume text for inspection. Users can search and filter jobs, inspect score components, save positions and track application progress. An optional DeepSeek integration explains strengths and suggests resume revisions after the user authorizes transmission. The revised text remains separate from the original resume.</w:t>
       </w:r>
     </w:p>
     <w:p>
+      <w:pPr>
+        <w:keepLines/>
+      </w:pPr>
       <w:r>
-        <w:t>The application will rank jobs using an explainable scoring method. It will combine weighted skill overlap, TF-IDF text similarity, work experience, location preferences, and educational requirements. Missing information will be identified explicitly rather than treated as a satisfied requirement. Users will see matched skills, potential gaps, and individual scoring components. These scores will support comparison and prioritization; they will not represent the probability of receiving a job offer.</w:t>
+        <w:t>The application collects public jobs from Remotive and Arbeitnow and supports authorized CSV, JSON and structured webpage imports. The revised scope also includes a frozen JobsDB research snapshot supplied through the group's OneDrive collection. This integration reads existing files locally. It does not claim a live JobsDB crawler or access to restricted recruitment APIs. Original source links and snapshot dates remain visible.</w:t>
       </w:r>
     </w:p>
     <w:p>
@@ -104,12 +88,23 @@
         <w:pageBreakBefore/>
       </w:pPr>
       <w:r>
-        <w:t>AI Assistance and Privacy</w:t>
+        <w:t>Matching and research data</w:t>
       </w:r>
     </w:p>
     <w:p>
+      <w:pPr>
+        <w:keepLines/>
+      </w:pPr>
       <w:r>
-        <w:t>An optional DeepSeek API integration will provide resume improvement suggestions, summarize evidence-supported strengths, and explain suitability for a selected position. AI-generated revisions will remain separate from the original resume and will require user review. Users will authorize the transmission of resume content before requesting AI assistance. API credentials will remain in local configuration and will be excluded from the submitted source package.</w:t>
+        <w:t>The ranker combines weighted skill F1 at 45%, TF-IDF text similarity at 25%, experience at 15%, location at 10% and education at 5%. Missing conditions leave the active denominator, and the interface shows condition coverage. Generic English and communication skills receive lower weights within the skill calculation. The result supports comparison and does not estimate an employer's hiring probability. DeepSeek provides assistance but does not determine the numeric score.</w:t>
+      </w:r>
+    </w:p>
+    <w:p>
+      <w:pPr>
+        <w:keepLines/>
+      </w:pPr>
+      <w:r>
+        <w:t>The selected JobsDB archive is dated 28 September 2026. Of 6,939 input records, 6,910 pass required-field validation. The application imports 6,908 after excluding two records already marked expired in the snapshot. Research evaluation retains all accepted records. Cleaning removes raw tracking and contact objects, strips HTML and masks common email and Hong Kong phone-like text. Historical job availability still requires verification at the original source.</w:t>
       </w:r>
     </w:p>
     <w:p>
@@ -117,12 +112,15 @@
         <w:pStyle w:val="Heading1"/>
       </w:pPr>
       <w:r>
-        <w:t>Technical Implementation</w:t>
+        <w:t>Python implementation and usability</w:t>
       </w:r>
     </w:p>
     <w:p>
+      <w:pPr>
+        <w:keepLines/>
+      </w:pPr>
       <w:r>
-        <w:t>The implementation will demonstrate modular Python programming through separate components for file processing, data collection, matching, database operations, and AI communication. SQLite will store jobs, preferences, and application records. Background tasks will handle external requests without blocking the interface. Additional features will include job filtering, CSV export, and an application board for tracking saved positions, submitted applications, and interview progress.</w:t>
+        <w:t>Separate Python modules handle resumes, data sources, benchmark conversion, matching, SQLite persistence, HTTP requests and AI calls. The design uses functions, classes, regular expressions, JSON, CSV, ZIP, gzip, parameterized SQL and a bounded thread pool. A browser GUI runs through main.py at http://127.0.0.1:8765/. Users start the Python service first rather than opening the HTML file directly. API keys and personal databases remain outside the submission package.</w:t>
       </w:r>
     </w:p>
     <w:p>
@@ -130,23 +128,29 @@
         <w:pStyle w:val="Heading1"/>
       </w:pPr>
       <w:r>
-        <w:t>Evaluation and Deliverables</w:t>
+        <w:t>Evaluation and deliverables</w:t>
       </w:r>
     </w:p>
     <w:p>
+      <w:pPr>
+        <w:keepLines/>
+      </w:pPr>
       <w:r>
-        <w:t>Evaluation will combine automated tests and representative user scenarios. Tests will cover invalid inputs, duplicate records, database persistence, scoring behavior, external-service failures, and malformed AI responses. A small labelled synthetic dataset will support reproducible ranking evaluation, with its limitations clearly stated. Fictional demonstration data will allow the core workflow to operate without internet access.</w:t>
+        <w:t>Verification combines offline tests, synthetic ranking examples, real service connectivity records and reproducible research-data measurements. The current implementation passes 71 local tests. Its recorded full ranking of 6,910 research jobs takes 4.0517 seconds median across three runs on macOS with Python 3.8.10. No human relevance labels were supplied for this snapshot, so the project does not report real-data precision, recall or NDCG. Human annotation and broader evaluation remain future work.</w:t>
       </w:r>
     </w:p>
     <w:p>
+      <w:pPr>
+        <w:keepLines/>
+      </w:pPr>
       <w:r>
-        <w:t>The expected outcome is a functional application accompanied by main.py, a README, test cases, technical documentation, a code review record, and presentation materials. Generative AI assistance will be disclosed, and group members will verify the implementation and document their actual individual contributions.</w:t>
+        <w:t>Deliverables include main.py, README.md, source code and tests in group11_project.zip, a five-slide group11_presentation.pptx, a timed demonstration guide and technical documentation. Each member must submit an individual PDF of at least 600 words describing actual contributions. The group must record its own 15-minute video and complete a five-minute classroom presentation. AI assistance is disclosed. Student IDs and personal contribution evidence remain to be supplied by the members.</w:t>
       </w:r>
     </w:p>
     <w:sectPr>
       <w:footerReference w:type="default" r:id="rId9"/>
       <w:pgSz w:w="11909" w:h="16834"/>
-      <w:pgMar w:top="1080" w:right="1080" w:bottom="1080" w:left="1080" w:header="720" w:footer="461" w:gutter="0"/>
+      <w:pgMar w:top="979" w:right="1080" w:bottom="979" w:left="1080" w:header="720" w:footer="432" w:gutter="0"/>
       <w:cols w:space="720"/>
       <w:docGrid w:linePitch="360"/>
     </w:sectPr>
@@ -159,21 +163,14 @@
   <w:p>
     <w:pPr>
       <w:pStyle w:val="Footer"/>
-      <w:spacing w:after="0"/>
       <w:jc w:val="right"/>
     </w:pPr>
     <w:r>
       <w:rPr>
-        <w:rFonts w:ascii="Arial" w:hAnsi="Arial"/>
-        <w:color w:val="5F5F5F"/>
-        <w:sz w:val="18"/>
-      </w:rPr>
-      <w:t xml:space="preserve">Group 11  |  </w:t>
-    </w:r>
-    <w:r>
-      <w:rPr>
-        <w:sz w:val="18"/>
-      </w:rPr>
+        <w:color w:val="5A5A5A"/>
+        <w:sz w:val="16"/>
+      </w:rPr>
+      <w:t xml:space="preserve">Group 11  |  Revised 30 September 2026  |  </w:t>
     </w:r>
     <w:fldSimple w:instr="PAGE"/>
   </w:p>
@@ -545,12 +542,12 @@
     <w:rsid w:val="00FC693F"/>
     <w:pPr>
       <w:widowControl/>
-      <w:spacing w:line="283" w:lineRule="auto" w:after="180"/>
+      <w:spacing w:line="269" w:lineRule="auto" w:after="140"/>
     </w:pPr>
     <w:rPr>
-      <w:rFonts w:ascii="Arial" w:hAnsi="Arial" w:eastAsia="Arial"/>
+      <w:rFonts w:ascii="Arial" w:hAnsi="Arial" w:eastAsia="PingFang SC"/>
       <w:color w:val="000000"/>
-      <w:sz w:val="24"/>
+      <w:sz w:val="21"/>
     </w:rPr>
   </w:style>
   <w:style w:type="paragraph" w:styleId="Header">
@@ -608,11 +605,12 @@
     <w:pPr>
       <w:keepNext/>
       <w:keepLines/>
-      <w:spacing w:before="260" w:after="100"/>
+      <w:widowControl/>
+      <w:spacing w:before="220" w:after="100"/>
       <w:outlineLvl w:val="0"/>
     </w:pPr>
     <w:rPr>
-      <w:rFonts w:asciiTheme="majorHAnsi" w:eastAsiaTheme="majorEastAsia" w:hAnsiTheme="majorHAnsi" w:cstheme="majorBidi" w:ascii="Arial" w:hAnsi="Arial" w:eastAsia="Arial"/>
+      <w:rFonts w:asciiTheme="majorHAnsi" w:eastAsiaTheme="majorEastAsia" w:hAnsiTheme="majorHAnsi" w:cstheme="majorBidi" w:ascii="Arial" w:hAnsi="Arial" w:eastAsia="PingFang SC"/>
       <w:b/>
       <w:bCs/>
       <w:color w:val="000000"/>
@@ -632,15 +630,16 @@
     <w:pPr>
       <w:keepNext/>
       <w:keepLines/>
-      <w:spacing w:before="200" w:after="0"/>
+      <w:widowControl/>
+      <w:spacing w:before="220" w:after="100"/>
       <w:outlineLvl w:val="1"/>
     </w:pPr>
     <w:rPr>
-      <w:rFonts w:asciiTheme="majorHAnsi" w:eastAsiaTheme="majorEastAsia" w:hAnsiTheme="majorHAnsi" w:cstheme="majorBidi" w:ascii="Arial" w:hAnsi="Arial" w:eastAsia="Arial"/>
+      <w:rFonts w:asciiTheme="majorHAnsi" w:eastAsiaTheme="majorEastAsia" w:hAnsiTheme="majorHAnsi" w:cstheme="majorBidi" w:ascii="Arial" w:hAnsi="Arial" w:eastAsia="PingFang SC"/>
       <w:b/>
       <w:bCs/>
       <w:color w:val="000000"/>
-      <w:sz w:val="26"/>
+      <w:sz w:val="24"/>
       <w:szCs w:val="26"/>
     </w:rPr>
   </w:style>
@@ -656,14 +655,16 @@
     <w:pPr>
       <w:keepNext/>
       <w:keepLines/>
-      <w:spacing w:before="200" w:after="0"/>
+      <w:widowControl/>
+      <w:spacing w:before="220" w:after="100"/>
       <w:outlineLvl w:val="2"/>
     </w:pPr>
     <w:rPr>
-      <w:rFonts w:asciiTheme="majorHAnsi" w:eastAsiaTheme="majorEastAsia" w:hAnsiTheme="majorHAnsi" w:cstheme="majorBidi"/>
+      <w:rFonts w:asciiTheme="majorHAnsi" w:eastAsiaTheme="majorEastAsia" w:hAnsiTheme="majorHAnsi" w:cstheme="majorBidi" w:ascii="Arial" w:hAnsi="Arial" w:eastAsia="PingFang SC"/>
       <w:b/>
       <w:bCs/>
-      <w:color w:val="4F81BD" w:themeColor="accent1"/>
+      <w:color w:val="000000"/>
+      <w:sz w:val="22"/>
     </w:rPr>
   </w:style>
   <w:style w:type="paragraph" w:styleId="Heading4">
@@ -895,11 +896,12 @@
     <w:rsid w:val="00FC693F"/>
     <w:pPr>
       <w:keepNext/>
-      <w:spacing w:after="100" w:line="240" w:lineRule="auto"/>
+      <w:widowControl/>
+      <w:spacing w:after="200" w:line="240" w:lineRule="auto"/>
       <w:contextualSpacing/>
     </w:pPr>
     <w:rPr>
-      <w:rFonts w:asciiTheme="majorHAnsi" w:eastAsiaTheme="majorEastAsia" w:hAnsiTheme="majorHAnsi" w:cstheme="majorBidi" w:ascii="Arial" w:hAnsi="Arial" w:eastAsia="Arial"/>
+      <w:rFonts w:asciiTheme="majorHAnsi" w:eastAsiaTheme="majorEastAsia" w:hAnsiTheme="majorHAnsi" w:cstheme="majorBidi" w:ascii="Arial" w:hAnsi="Arial" w:eastAsia="PingFang SC"/>
       <w:b/>
       <w:color w:val="000000"/>
       <w:spacing w:val="5"/>
@@ -933,18 +935,18 @@
     <w:rsid w:val="00FC693F"/>
     <w:pPr>
       <w:keepNext/>
+      <w:widowControl/>
       <w:numPr>
         <w:ilvl w:val="1"/>
       </w:numPr>
-      <w:spacing w:after="200"/>
     </w:pPr>
     <w:rPr>
-      <w:rFonts w:asciiTheme="majorHAnsi" w:eastAsiaTheme="majorEastAsia" w:hAnsiTheme="majorHAnsi" w:cstheme="majorBidi" w:ascii="Arial" w:hAnsi="Arial" w:eastAsia="Arial"/>
+      <w:rFonts w:asciiTheme="majorHAnsi" w:eastAsiaTheme="majorEastAsia" w:hAnsiTheme="majorHAnsi" w:cstheme="majorBidi" w:ascii="Arial" w:hAnsi="Arial" w:eastAsia="PingFang SC"/>
       <w:i/>
       <w:iCs/>
       <w:color w:val="000000"/>
       <w:spacing w:val="15"/>
-      <w:sz w:val="23"/>
+      <w:sz w:val="24"/>
       <w:szCs w:val="24"/>
     </w:rPr>
   </w:style>
@@ -1382,9 +1384,6 @@
     <w:qFormat/>
     <w:rsid w:val="00FC693F"/>
     <w:pPr>
-      <w:pBdr>
-        <w:bottom w:val="single" w:sz="4" w:space="4" w:color="4F81BD" w:themeColor="accent1"/>
-      </w:pBdr>
       <w:spacing w:before="200" w:after="280"/>
       <w:ind w:left="936" w:right="936"/>
     </w:pPr>

</xml_diff>